<commit_message>
MRD-3244 update Part A template + preview
</commit_message>
<xml_diff>
--- a/src/main/resources/templates/partA/2026-07-29 - FTR56 Offence conviction/Part A Template.docx
+++ b/src/main/resources/templates/partA/2026-07-29 - FTR56 Offence conviction/Part A Template.docx
@@ -416,7 +416,7 @@
       <w:r>
         <w:rPr>
           <w:rFonts w:ascii="Arial" w:hAnsi="Arial" w:cs="Arial"/>
-          <w:bCs/>
+          <w:b/>
         </w:rPr>
         <w:t>{{</w:t>
       </w:r>
@@ -424,7 +424,7 @@
       <w:r>
         <w:rPr>
           <w:rFonts w:ascii="Arial" w:hAnsi="Arial" w:cs="Arial"/>
-          <w:bCs/>
+          <w:b/>
         </w:rPr>
         <w:t>is_this_an_emergency_recall</w:t>
       </w:r>
@@ -432,7 +432,7 @@
       <w:r>
         <w:rPr>
           <w:rFonts w:ascii="Arial" w:hAnsi="Arial" w:cs="Arial"/>
-          <w:bCs/>
+          <w:b/>
         </w:rPr>
         <w:t>}}</w:t>
       </w:r>
@@ -506,7 +506,7 @@
       <w:r>
         <w:rPr>
           <w:rFonts w:ascii="Arial" w:hAnsi="Arial" w:cs="Arial"/>
-          <w:bCs/>
+          <w:b/>
         </w:rPr>
         <w:t>{{</w:t>
       </w:r>
@@ -514,7 +514,7 @@
       <w:r>
         <w:rPr>
           <w:rFonts w:ascii="Arial" w:hAnsi="Arial" w:cs="Arial"/>
-          <w:bCs/>
+          <w:b/>
         </w:rPr>
         <w:t>indeterminate_sentence_type</w:t>
       </w:r>
@@ -522,16 +522,16 @@
       <w:r>
         <w:rPr>
           <w:rFonts w:ascii="Arial" w:hAnsi="Arial" w:cs="Arial"/>
-          <w:bCs/>
-        </w:rPr>
-        <w:t>}} (</w:t>
-      </w:r>
-      <w:r>
-        <w:rPr>
-          <w:rFonts w:ascii="Arial" w:hAnsi="Arial" w:cs="Arial"/>
-          <w:bCs/>
-        </w:rPr>
-        <w:t>If yes move to Section 6)</w:t>
+          <w:b/>
+        </w:rPr>
+        <w:t xml:space="preserve">}} </w:t>
+      </w:r>
+      <w:r>
+        <w:rPr>
+          <w:rFonts w:ascii="Arial" w:hAnsi="Arial" w:cs="Arial"/>
+          <w:bCs/>
+        </w:rPr>
+        <w:t>(If yes move to Section 6)</w:t>
       </w:r>
       <w:r>
         <w:rPr>
@@ -583,7 +583,7 @@
       <w:r>
         <w:rPr>
           <w:rFonts w:ascii="Arial" w:hAnsi="Arial" w:cs="Arial"/>
-          <w:bCs/>
+          <w:b/>
         </w:rPr>
         <w:t>{{</w:t>
       </w:r>
@@ -591,7 +591,7 @@
       <w:r>
         <w:rPr>
           <w:rFonts w:ascii="Arial" w:hAnsi="Arial" w:cs="Arial"/>
-          <w:bCs/>
+          <w:b/>
         </w:rPr>
         <w:t>is_extended_sentence</w:t>
       </w:r>
@@ -599,16 +599,16 @@
       <w:r>
         <w:rPr>
           <w:rFonts w:ascii="Arial" w:hAnsi="Arial" w:cs="Arial"/>
-          <w:bCs/>
-        </w:rPr>
-        <w:t>}}</w:t>
-      </w:r>
-      <w:r>
-        <w:rPr>
-          <w:rFonts w:ascii="Arial" w:hAnsi="Arial" w:cs="Arial"/>
-          <w:bCs/>
-        </w:rPr>
-        <w:t xml:space="preserve"> (If yes move to Section 6)</w:t>
+          <w:b/>
+        </w:rPr>
+        <w:t xml:space="preserve">}} </w:t>
+      </w:r>
+      <w:r>
+        <w:rPr>
+          <w:rFonts w:ascii="Arial" w:hAnsi="Arial" w:cs="Arial"/>
+          <w:bCs/>
+        </w:rPr>
+        <w:t>(If yes move to Section 6)</w:t>
       </w:r>
     </w:p>
     <w:p>
@@ -748,13 +748,20 @@
           <w:rFonts w:ascii="Arial" w:hAnsi="Arial" w:cs="Arial"/>
           <w:bCs/>
         </w:rPr>
-        <w:t xml:space="preserve"> {{</w:t>
+        <w:t xml:space="preserve"> </w:t>
+      </w:r>
+      <w:r>
+        <w:rPr>
+          <w:rFonts w:ascii="Arial" w:hAnsi="Arial" w:cs="Arial"/>
+          <w:b/>
+        </w:rPr>
+        <w:t>{{</w:t>
       </w:r>
       <w:proofErr w:type="spellStart"/>
       <w:r>
         <w:rPr>
           <w:rFonts w:ascii="Arial" w:hAnsi="Arial" w:cs="Arial"/>
-          <w:bCs/>
+          <w:b/>
         </w:rPr>
         <w:t>is_serving_youth_sentence</w:t>
       </w:r>
@@ -762,7 +769,7 @@
       <w:r>
         <w:rPr>
           <w:rFonts w:ascii="Arial" w:hAnsi="Arial" w:cs="Arial"/>
-          <w:bCs/>
+          <w:b/>
         </w:rPr>
         <w:t>}}</w:t>
       </w:r>
@@ -800,7 +807,7 @@
       <w:r>
         <w:rPr>
           <w:rFonts w:ascii="Arial" w:hAnsi="Arial" w:cs="Arial"/>
-          <w:bCs/>
+          <w:b/>
         </w:rPr>
         <w:t>{{</w:t>
       </w:r>
@@ -808,7 +815,7 @@
       <w:r>
         <w:rPr>
           <w:rFonts w:ascii="Arial" w:hAnsi="Arial" w:cs="Arial"/>
-          <w:bCs/>
+          <w:b/>
         </w:rPr>
         <w:t>is_serving_youth_sentence</w:t>
       </w:r>
@@ -816,7 +823,7 @@
       <w:r>
         <w:rPr>
           <w:rFonts w:ascii="Arial" w:hAnsi="Arial" w:cs="Arial"/>
-          <w:bCs/>
+          <w:b/>
         </w:rPr>
         <w:t>}}</w:t>
       </w:r>
@@ -951,23 +958,9 @@
       <w:r>
         <w:rPr>
           <w:rFonts w:ascii="Arial" w:hAnsi="Arial" w:cs="Arial"/>
-          <w:bCs/>
-        </w:rPr>
-        <w:t>{{is_mappa_level_2_or_3</w:t>
-      </w:r>
-      <w:r>
-        <w:rPr>
-          <w:rFonts w:ascii="Arial" w:hAnsi="Arial" w:cs="Arial"/>
-          <w:bCs/>
-        </w:rPr>
-        <w:t>_as_youth_sds_under_12_months</w:t>
-      </w:r>
-      <w:r>
-        <w:rPr>
-          <w:rFonts w:ascii="Arial" w:hAnsi="Arial" w:cs="Arial"/>
-          <w:bCs/>
-        </w:rPr>
-        <w:t>}}</w:t>
+          <w:b/>
+        </w:rPr>
+        <w:t>{{is_mappa_level_2_or_3_as_youth_sds_under_12_months}}</w:t>
       </w:r>
     </w:p>
     <w:p>
@@ -1003,7 +996,7 @@
       <w:r>
         <w:rPr>
           <w:rFonts w:ascii="Arial" w:hAnsi="Arial" w:cs="Arial"/>
-          <w:bCs/>
+          <w:b/>
         </w:rPr>
         <w:t>{{</w:t>
       </w:r>
@@ -1011,7 +1004,7 @@
       <w:r>
         <w:rPr>
           <w:rFonts w:ascii="Arial" w:hAnsi="Arial" w:cs="Arial"/>
-          <w:bCs/>
+          <w:b/>
         </w:rPr>
         <w:t>is_youth_charged_with_serious_offence</w:t>
       </w:r>
@@ -1019,7 +1012,7 @@
       <w:r>
         <w:rPr>
           <w:rFonts w:ascii="Arial" w:hAnsi="Arial" w:cs="Arial"/>
-          <w:bCs/>
+          <w:b/>
         </w:rPr>
         <w:t>}}</w:t>
       </w:r>
@@ -1162,7 +1155,7 @@
       <w:r>
         <w:rPr>
           <w:rFonts w:ascii="Arial" w:hAnsi="Arial" w:cs="Arial"/>
-          <w:bCs/>
+          <w:b/>
         </w:rPr>
         <w:t>{{</w:t>
       </w:r>
@@ -1170,7 +1163,7 @@
       <w:r>
         <w:rPr>
           <w:rFonts w:ascii="Arial" w:hAnsi="Arial" w:cs="Arial"/>
-          <w:bCs/>
+          <w:b/>
         </w:rPr>
         <w:t>is_charged_and_convicted_with_offence</w:t>
       </w:r>
@@ -1178,7 +1171,7 @@
       <w:r>
         <w:rPr>
           <w:rFonts w:ascii="Arial" w:hAnsi="Arial" w:cs="Arial"/>
-          <w:bCs/>
+          <w:b/>
         </w:rPr>
         <w:t>}}</w:t>
       </w:r>
@@ -1257,36 +1250,37 @@
         <w:outlineLvl w:val="1"/>
         <w:rPr>
           <w:rFonts w:ascii="Arial" w:hAnsi="Arial" w:cs="Arial"/>
-        </w:rPr>
-      </w:pPr>
-      <w:r>
-        <w:rPr>
-          <w:rFonts w:ascii="Arial" w:hAnsi="Arial" w:cs="Arial"/>
-        </w:rPr>
-        <w:t xml:space="preserve">Is their MAPPA level 2 or 3? </w:t>
-      </w:r>
-      <w:r>
-        <w:rPr>
-          <w:rFonts w:ascii="Arial" w:hAnsi="Arial" w:cs="Arial"/>
-          <w:bCs/>
-        </w:rPr>
-        <w:t>{{is_mappa_level_2_or_3</w:t>
-      </w:r>
-      <w:r>
-        <w:rPr>
-          <w:rFonts w:ascii="Arial" w:hAnsi="Arial" w:cs="Arial"/>
-          <w:bCs/>
-        </w:rPr>
-        <w:t>_as_adult_sds</w:t>
-      </w:r>
-      <w:r>
-        <w:rPr>
-          <w:rFonts w:ascii="Arial" w:hAnsi="Arial" w:cs="Arial"/>
-          <w:bCs/>
-        </w:rPr>
-        <w:t>}}</w:t>
-      </w:r>
-      <w:r>
+          <w:b/>
+          <w:bCs/>
+        </w:rPr>
+      </w:pPr>
+      <w:r>
+        <w:rPr>
+          <w:rFonts w:ascii="Arial" w:hAnsi="Arial" w:cs="Arial"/>
+        </w:rPr>
+        <w:t>Is their MAPPA level 2 or 3?</w:t>
+      </w:r>
+      <w:r>
+        <w:rPr>
+          <w:rFonts w:ascii="Arial" w:hAnsi="Arial" w:cs="Arial"/>
+          <w:b/>
+          <w:bCs/>
+        </w:rPr>
+        <w:t xml:space="preserve"> </w:t>
+      </w:r>
+      <w:r>
+        <w:rPr>
+          <w:rFonts w:ascii="Arial" w:hAnsi="Arial" w:cs="Arial"/>
+          <w:b/>
+          <w:bCs/>
+        </w:rPr>
+        <w:t>{{is_mappa_level_2_or_3_as_adult_sds}}</w:t>
+      </w:r>
+      <w:r>
+        <w:rPr>
+          <w:b/>
+          <w:bCs/>
+        </w:rPr>
         <w:br/>
       </w:r>
       <w:r>
@@ -1299,12 +1293,14 @@
         <w:rPr>
           <w:rFonts w:ascii="Arial" w:hAnsi="Arial" w:cs="Arial"/>
           <w:b/>
+          <w:bCs/>
         </w:rPr>
         <w:t xml:space="preserve"> </w:t>
       </w:r>
       <w:r>
         <w:rPr>
           <w:rFonts w:ascii="Arial" w:hAnsi="Arial" w:cs="Arial"/>
+          <w:b/>
           <w:bCs/>
         </w:rPr>
         <w:t>{{</w:t>
@@ -1313,42 +1309,16 @@
       <w:r>
         <w:rPr>
           <w:rFonts w:ascii="Arial" w:hAnsi="Arial" w:cs="Arial"/>
-          <w:bCs/>
-        </w:rPr>
-        <w:t>is_serving_</w:t>
-      </w:r>
-      <w:r>
-        <w:rPr>
-          <w:rFonts w:ascii="Arial" w:hAnsi="Arial" w:cs="Arial"/>
-          <w:bCs/>
-        </w:rPr>
-        <w:t>sopc</w:t>
-      </w:r>
-      <w:r>
-        <w:rPr>
-          <w:rFonts w:ascii="Arial" w:hAnsi="Arial" w:cs="Arial"/>
-          <w:bCs/>
-        </w:rPr>
-        <w:t>_</w:t>
-      </w:r>
-      <w:r>
-        <w:rPr>
-          <w:rFonts w:ascii="Arial" w:hAnsi="Arial" w:cs="Arial"/>
-          <w:bCs/>
-        </w:rPr>
-        <w:t>s</w:t>
-      </w:r>
-      <w:r>
-        <w:rPr>
-          <w:rFonts w:ascii="Arial" w:hAnsi="Arial" w:cs="Arial"/>
-          <w:bCs/>
-        </w:rPr>
-        <w:t>entence</w:t>
+          <w:b/>
+          <w:bCs/>
+        </w:rPr>
+        <w:t>is_serving_sopc_sentence</w:t>
       </w:r>
       <w:proofErr w:type="spellEnd"/>
       <w:r>
         <w:rPr>
           <w:rFonts w:ascii="Arial" w:hAnsi="Arial" w:cs="Arial"/>
+          <w:b/>
           <w:bCs/>
         </w:rPr>
         <w:t>}}</w:t>
@@ -1367,17 +1337,28 @@
         <w:outlineLvl w:val="1"/>
         <w:rPr>
           <w:rFonts w:ascii="Arial" w:hAnsi="Arial" w:cs="Arial"/>
-        </w:rPr>
-      </w:pPr>
-      <w:r>
-        <w:rPr>
-          <w:rFonts w:ascii="Arial" w:hAnsi="Arial" w:cs="Arial"/>
-        </w:rPr>
-        <w:t xml:space="preserve">Are they serving a Discretionary Conditional Release (DCR) sentence? </w:t>
-      </w:r>
-      <w:r>
-        <w:rPr>
-          <w:rFonts w:ascii="Arial" w:hAnsi="Arial" w:cs="Arial"/>
+          <w:b/>
+          <w:bCs/>
+        </w:rPr>
+      </w:pPr>
+      <w:r>
+        <w:rPr>
+          <w:rFonts w:ascii="Arial" w:hAnsi="Arial" w:cs="Arial"/>
+        </w:rPr>
+        <w:t>Are they serving a Discretionary Conditional Release (DCR) sentence?</w:t>
+      </w:r>
+      <w:r>
+        <w:rPr>
+          <w:rFonts w:ascii="Arial" w:hAnsi="Arial" w:cs="Arial"/>
+          <w:b/>
+          <w:bCs/>
+        </w:rPr>
+        <w:t xml:space="preserve"> </w:t>
+      </w:r>
+      <w:r>
+        <w:rPr>
+          <w:rFonts w:ascii="Arial" w:hAnsi="Arial" w:cs="Arial"/>
+          <w:b/>
           <w:bCs/>
         </w:rPr>
         <w:t>{{</w:t>
@@ -1386,28 +1367,16 @@
       <w:r>
         <w:rPr>
           <w:rFonts w:ascii="Arial" w:hAnsi="Arial" w:cs="Arial"/>
-          <w:bCs/>
-        </w:rPr>
-        <w:t>is_serving_</w:t>
-      </w:r>
-      <w:r>
-        <w:rPr>
-          <w:rFonts w:ascii="Arial" w:hAnsi="Arial" w:cs="Arial"/>
-          <w:bCs/>
-        </w:rPr>
-        <w:t>dcr</w:t>
-      </w:r>
-      <w:r>
-        <w:rPr>
-          <w:rFonts w:ascii="Arial" w:hAnsi="Arial" w:cs="Arial"/>
-          <w:bCs/>
-        </w:rPr>
-        <w:t>_sentence</w:t>
+          <w:b/>
+          <w:bCs/>
+        </w:rPr>
+        <w:t>is_serving_dcr_sentence</w:t>
       </w:r>
       <w:proofErr w:type="spellEnd"/>
       <w:r>
         <w:rPr>
           <w:rFonts w:ascii="Arial" w:hAnsi="Arial" w:cs="Arial"/>
+          <w:b/>
           <w:bCs/>
         </w:rPr>
         <w:t>}}</w:t>
@@ -1426,6 +1395,8 @@
         <w:outlineLvl w:val="1"/>
         <w:rPr>
           <w:rFonts w:ascii="Arial" w:hAnsi="Arial" w:cs="Arial"/>
+          <w:b/>
+          <w:bCs/>
         </w:rPr>
       </w:pPr>
       <w:r>
@@ -1433,11 +1404,20 @@
           <w:rFonts w:ascii="Arial" w:hAnsi="Arial" w:cs="Arial"/>
         </w:rPr>
         <w:lastRenderedPageBreak/>
-        <w:t xml:space="preserve">Were they referred to the Parole Board under section 244ZB (power to detain) on this sentence? </w:t>
-      </w:r>
-      <w:r>
-        <w:rPr>
-          <w:rFonts w:ascii="Arial" w:hAnsi="Arial" w:cs="Arial"/>
+        <w:t>Were they referred to the Parole Board under section 244ZB (power to detain) on this sentence?</w:t>
+      </w:r>
+      <w:r>
+        <w:rPr>
+          <w:rFonts w:ascii="Arial" w:hAnsi="Arial" w:cs="Arial"/>
+          <w:b/>
+          <w:bCs/>
+        </w:rPr>
+        <w:t xml:space="preserve"> </w:t>
+      </w:r>
+      <w:r>
+        <w:rPr>
+          <w:rFonts w:ascii="Arial" w:hAnsi="Arial" w:cs="Arial"/>
+          <w:b/>
           <w:bCs/>
         </w:rPr>
         <w:t>{{was_referred_to_parole_board_244zb}}</w:t>
@@ -1456,17 +1436,28 @@
         <w:outlineLvl w:val="1"/>
         <w:rPr>
           <w:rFonts w:ascii="Arial" w:hAnsi="Arial" w:cs="Arial"/>
-        </w:rPr>
-      </w:pPr>
-      <w:r>
-        <w:rPr>
-          <w:rFonts w:ascii="Arial" w:hAnsi="Arial" w:cs="Arial"/>
-        </w:rPr>
-        <w:t xml:space="preserve">Have they been repatriated to the UK following a sentence for murder? </w:t>
-      </w:r>
-      <w:r>
-        <w:rPr>
-          <w:rFonts w:ascii="Arial" w:hAnsi="Arial" w:cs="Arial"/>
+          <w:b/>
+          <w:bCs/>
+        </w:rPr>
+      </w:pPr>
+      <w:r>
+        <w:rPr>
+          <w:rFonts w:ascii="Arial" w:hAnsi="Arial" w:cs="Arial"/>
+        </w:rPr>
+        <w:t>Have they been repatriated to the UK following a sentence for murder?</w:t>
+      </w:r>
+      <w:r>
+        <w:rPr>
+          <w:rFonts w:ascii="Arial" w:hAnsi="Arial" w:cs="Arial"/>
+          <w:b/>
+          <w:bCs/>
+        </w:rPr>
+        <w:t xml:space="preserve"> </w:t>
+      </w:r>
+      <w:r>
+        <w:rPr>
+          <w:rFonts w:ascii="Arial" w:hAnsi="Arial" w:cs="Arial"/>
+          <w:b/>
           <w:bCs/>
         </w:rPr>
         <w:t>{{</w:t>
@@ -1475,6 +1466,7 @@
       <w:r>
         <w:rPr>
           <w:rFonts w:ascii="Arial" w:hAnsi="Arial" w:cs="Arial"/>
+          <w:b/>
           <w:bCs/>
         </w:rPr>
         <w:t>was_repatriated_for_murder</w:t>
@@ -1483,6 +1475,7 @@
       <w:r>
         <w:rPr>
           <w:rFonts w:ascii="Arial" w:hAnsi="Arial" w:cs="Arial"/>
+          <w:b/>
           <w:bCs/>
         </w:rPr>
         <w:t>}}</w:t>
@@ -1501,34 +1494,31 @@
         <w:outlineLvl w:val="1"/>
         <w:rPr>
           <w:rFonts w:ascii="Arial" w:hAnsi="Arial" w:cs="Arial"/>
-        </w:rPr>
-      </w:pPr>
-      <w:r>
-        <w:rPr>
-          <w:rFonts w:ascii="Arial" w:hAnsi="Arial" w:cs="Arial"/>
-        </w:rPr>
-        <w:t xml:space="preserve">Are they MAPPA category 4? </w:t>
-      </w:r>
-      <w:r>
-        <w:rPr>
-          <w:rFonts w:ascii="Arial" w:hAnsi="Arial" w:cs="Arial"/>
-          <w:bCs/>
-        </w:rPr>
-        <w:t>{{is_mappa_category_4</w:t>
-      </w:r>
-      <w:r>
-        <w:rPr>
-          <w:rFonts w:ascii="Arial" w:hAnsi="Arial" w:cs="Arial"/>
-          <w:bCs/>
-        </w:rPr>
-        <w:t>_as_adult_sds</w:t>
-      </w:r>
-      <w:r>
-        <w:rPr>
-          <w:rFonts w:ascii="Arial" w:hAnsi="Arial" w:cs="Arial"/>
-          <w:bCs/>
-        </w:rPr>
-        <w:t>}}</w:t>
+          <w:b/>
+          <w:bCs/>
+        </w:rPr>
+      </w:pPr>
+      <w:r>
+        <w:rPr>
+          <w:rFonts w:ascii="Arial" w:hAnsi="Arial" w:cs="Arial"/>
+        </w:rPr>
+        <w:t>Are they MAPPA category 4?</w:t>
+      </w:r>
+      <w:r>
+        <w:rPr>
+          <w:rFonts w:ascii="Arial" w:hAnsi="Arial" w:cs="Arial"/>
+          <w:b/>
+          <w:bCs/>
+        </w:rPr>
+        <w:t xml:space="preserve"> </w:t>
+      </w:r>
+      <w:r>
+        <w:rPr>
+          <w:rFonts w:ascii="Arial" w:hAnsi="Arial" w:cs="Arial"/>
+          <w:b/>
+          <w:bCs/>
+        </w:rPr>
+        <w:t>{{is_mappa_category_4_as_adult_sds}}</w:t>
       </w:r>
     </w:p>
     <w:p>
@@ -1544,17 +1534,28 @@
         <w:outlineLvl w:val="1"/>
         <w:rPr>
           <w:rFonts w:ascii="Arial" w:hAnsi="Arial" w:cs="Arial"/>
-        </w:rPr>
-      </w:pPr>
-      <w:r>
-        <w:rPr>
-          <w:rFonts w:ascii="Arial" w:hAnsi="Arial" w:cs="Arial"/>
-        </w:rPr>
-        <w:t xml:space="preserve">Are they considered to be a person who may be at risk of involvement in foreign power threat activity? </w:t>
-      </w:r>
-      <w:r>
-        <w:rPr>
-          <w:rFonts w:ascii="Arial" w:hAnsi="Arial" w:cs="Arial"/>
+          <w:b/>
+          <w:bCs/>
+        </w:rPr>
+      </w:pPr>
+      <w:r>
+        <w:rPr>
+          <w:rFonts w:ascii="Arial" w:hAnsi="Arial" w:cs="Arial"/>
+        </w:rPr>
+        <w:t>Are they considered to be a person who may be at risk of involvement in foreign power threat activity?</w:t>
+      </w:r>
+      <w:r>
+        <w:rPr>
+          <w:rFonts w:ascii="Arial" w:hAnsi="Arial" w:cs="Arial"/>
+          <w:b/>
+          <w:bCs/>
+        </w:rPr>
+        <w:t xml:space="preserve"> </w:t>
+      </w:r>
+      <w:r>
+        <w:rPr>
+          <w:rFonts w:ascii="Arial" w:hAnsi="Arial" w:cs="Arial"/>
+          <w:b/>
           <w:bCs/>
         </w:rPr>
         <w:t>{{</w:t>
@@ -1563,6 +1564,7 @@
       <w:r>
         <w:rPr>
           <w:rFonts w:ascii="Arial" w:hAnsi="Arial" w:cs="Arial"/>
+          <w:b/>
           <w:bCs/>
         </w:rPr>
         <w:t>is_at_risk_of_involved_in_foreign_power_threat</w:t>
@@ -1571,6 +1573,7 @@
       <w:r>
         <w:rPr>
           <w:rFonts w:ascii="Arial" w:hAnsi="Arial" w:cs="Arial"/>
+          <w:b/>
           <w:bCs/>
         </w:rPr>
         <w:t>}}</w:t>
@@ -1589,17 +1592,28 @@
         <w:outlineLvl w:val="1"/>
         <w:rPr>
           <w:rFonts w:ascii="Arial" w:hAnsi="Arial" w:cs="Arial"/>
-        </w:rPr>
-      </w:pPr>
-      <w:r>
-        <w:rPr>
-          <w:rFonts w:ascii="Arial" w:hAnsi="Arial" w:cs="Arial"/>
-        </w:rPr>
-        <w:t xml:space="preserve">Are they serving a sentence for a terrorist or national security offence? </w:t>
-      </w:r>
-      <w:r>
-        <w:rPr>
-          <w:rFonts w:ascii="Arial" w:hAnsi="Arial" w:cs="Arial"/>
+          <w:b/>
+          <w:bCs/>
+        </w:rPr>
+      </w:pPr>
+      <w:r>
+        <w:rPr>
+          <w:rFonts w:ascii="Arial" w:hAnsi="Arial" w:cs="Arial"/>
+        </w:rPr>
+        <w:t>Are they serving a sentence for a terrorist or national security offence?</w:t>
+      </w:r>
+      <w:r>
+        <w:rPr>
+          <w:rFonts w:ascii="Arial" w:hAnsi="Arial" w:cs="Arial"/>
+          <w:b/>
+          <w:bCs/>
+        </w:rPr>
+        <w:t xml:space="preserve"> </w:t>
+      </w:r>
+      <w:r>
+        <w:rPr>
+          <w:rFonts w:ascii="Arial" w:hAnsi="Arial" w:cs="Arial"/>
+          <w:b/>
           <w:bCs/>
         </w:rPr>
         <w:t>{{</w:t>
@@ -1608,21 +1622,16 @@
       <w:r>
         <w:rPr>
           <w:rFonts w:ascii="Arial" w:hAnsi="Arial" w:cs="Arial"/>
-          <w:bCs/>
-        </w:rPr>
-        <w:t>is_serving_terrorist_or_national_</w:t>
-      </w:r>
-      <w:r>
-        <w:rPr>
-          <w:rFonts w:ascii="Arial" w:hAnsi="Arial" w:cs="Arial"/>
-          <w:bCs/>
-        </w:rPr>
-        <w:t>security_offence</w:t>
+          <w:b/>
+          <w:bCs/>
+        </w:rPr>
+        <w:t>is_serving_terrorist_or_national_security_offence</w:t>
       </w:r>
       <w:proofErr w:type="spellEnd"/>
       <w:r>
         <w:rPr>
           <w:rFonts w:ascii="Arial" w:hAnsi="Arial" w:cs="Arial"/>
+          <w:b/>
           <w:bCs/>
         </w:rPr>
         <w:t>}}</w:t>
@@ -19638,6 +19647,7 @@
     <w:rsid w:val="002E2013"/>
     <w:rsid w:val="00314A9B"/>
     <w:rsid w:val="0031554E"/>
+    <w:rsid w:val="00323EAB"/>
     <w:rsid w:val="003371B1"/>
     <w:rsid w:val="00340D3A"/>
     <w:rsid w:val="00362F55"/>
@@ -19698,6 +19708,7 @@
     <w:rsid w:val="00B5434A"/>
     <w:rsid w:val="00B60D5F"/>
     <w:rsid w:val="00BA6EAB"/>
+    <w:rsid w:val="00BA736E"/>
     <w:rsid w:val="00BA77B8"/>
     <w:rsid w:val="00BE6AD5"/>
     <w:rsid w:val="00C22920"/>
@@ -20499,15 +20510,6 @@
 </file>
 
 <file path=customXml/item1.xml><?xml version="1.0" encoding="utf-8"?>
-<?mso-contentType ?>
-<FormTemplates xmlns="http://schemas.microsoft.com/sharepoint/v3/contenttype/forms">
-  <Display>DocumentLibraryForm</Display>
-  <Edit>DocumentLibraryForm</Edit>
-  <New>DocumentLibraryForm</New>
-</FormTemplates>
-</file>
-
-<file path=customXml/item2.xml><?xml version="1.0" encoding="utf-8"?>
 <ct:contentTypeSchema xmlns:ct="http://schemas.microsoft.com/office/2006/metadata/contentType" xmlns:ma="http://schemas.microsoft.com/office/2006/metadata/properties/metaAttributes" ct:_="" ma:_="" ma:contentTypeName="Document" ma:contentTypeID="0x010100BB15E224CEB19F4BA17DCD08B156C20E" ma:contentTypeVersion="14" ma:contentTypeDescription="Create a new document." ma:contentTypeScope="" ma:versionID="7cd304efa23d0061db26e2f05b6414b1">
   <xsd:schema xmlns:xsd="http://www.w3.org/2001/XMLSchema" xmlns:xs="http://www.w3.org/2001/XMLSchema" xmlns:p="http://schemas.microsoft.com/office/2006/metadata/properties" xmlns:ns2="2244256a-353e-4aaa-84de-68fbd58bc0b5" xmlns:ns3="461e5654-0e9a-4527-837d-fdc364c1f1ed" targetNamespace="http://schemas.microsoft.com/office/2006/metadata/properties" ma:root="true" ma:fieldsID="44df93feef4834377720eaaf16faf4fa" ns2:_="" ns3:_="">
     <xsd:import namespace="2244256a-353e-4aaa-84de-68fbd58bc0b5"/>
@@ -20720,11 +20722,16 @@
 </ct:contentTypeSchema>
 </file>
 
-<file path=customXml/item3.xml><?xml version="1.0" encoding="utf-8"?>
-<b:Sources xmlns:b="http://schemas.openxmlformats.org/officeDocument/2006/bibliography" xmlns="http://schemas.openxmlformats.org/officeDocument/2006/bibliography" SelectedStyle="" StyleName="" Version="0"/>
+<file path=customXml/item2.xml><?xml version="1.0" encoding="utf-8"?>
+<?mso-contentType ?>
+<FormTemplates xmlns="http://schemas.microsoft.com/sharepoint/v3/contenttype/forms">
+  <Display>DocumentLibraryForm</Display>
+  <Edit>DocumentLibraryForm</Edit>
+  <New>DocumentLibraryForm</New>
+</FormTemplates>
 </file>
 
-<file path=customXml/item4.xml><?xml version="1.0" encoding="utf-8"?>
+<file path=customXml/item3.xml><?xml version="1.0" encoding="utf-8"?>
 <p:properties xmlns:p="http://schemas.microsoft.com/office/2006/metadata/properties" xmlns:xsi="http://www.w3.org/2001/XMLSchema-instance" xmlns:pc="http://schemas.microsoft.com/office/infopath/2007/PartnerControls">
   <documentManagement>
     <lcf76f155ced4ddcb4097134ff3c332f xmlns="2244256a-353e-4aaa-84de-68fbd58bc0b5">
@@ -20736,15 +20743,11 @@
 </p:properties>
 </file>
 
-<file path=customXml/itemProps1.xml><?xml version="1.0" encoding="utf-8"?>
-<ds:datastoreItem xmlns:ds="http://schemas.openxmlformats.org/officeDocument/2006/customXml" ds:itemID="{9C893AAC-1781-44C1-940F-A467E506D9D1}">
-  <ds:schemaRefs>
-    <ds:schemaRef ds:uri="http://schemas.microsoft.com/sharepoint/v3/contenttype/forms"/>
-  </ds:schemaRefs>
-</ds:datastoreItem>
+<file path=customXml/item4.xml><?xml version="1.0" encoding="utf-8"?>
+<b:Sources xmlns:b="http://schemas.openxmlformats.org/officeDocument/2006/bibliography" xmlns="http://schemas.openxmlformats.org/officeDocument/2006/bibliography" SelectedStyle="" StyleName="" Version="0"/>
 </file>
 
-<file path=customXml/itemProps2.xml><?xml version="1.0" encoding="utf-8"?>
+<file path=customXml/itemProps1.xml><?xml version="1.0" encoding="utf-8"?>
 <ds:datastoreItem xmlns:ds="http://schemas.openxmlformats.org/officeDocument/2006/customXml" ds:itemID="{79C448BA-7A2C-492D-9615-F080CE57201F}">
   <ds:schemaRefs>
     <ds:schemaRef ds:uri="http://schemas.microsoft.com/office/2006/metadata/contentType"/>
@@ -20763,15 +20766,15 @@
 </ds:datastoreItem>
 </file>
 
-<file path=customXml/itemProps3.xml><?xml version="1.0" encoding="utf-8"?>
-<ds:datastoreItem xmlns:ds="http://schemas.openxmlformats.org/officeDocument/2006/customXml" ds:itemID="{1AA002EC-9FAC-469B-886C-4AD0DF10DF17}">
+<file path=customXml/itemProps2.xml><?xml version="1.0" encoding="utf-8"?>
+<ds:datastoreItem xmlns:ds="http://schemas.openxmlformats.org/officeDocument/2006/customXml" ds:itemID="{9C893AAC-1781-44C1-940F-A467E506D9D1}">
   <ds:schemaRefs>
-    <ds:schemaRef ds:uri="http://schemas.openxmlformats.org/officeDocument/2006/bibliography"/>
+    <ds:schemaRef ds:uri="http://schemas.microsoft.com/sharepoint/v3/contenttype/forms"/>
   </ds:schemaRefs>
 </ds:datastoreItem>
 </file>
 
-<file path=customXml/itemProps4.xml><?xml version="1.0" encoding="utf-8"?>
+<file path=customXml/itemProps3.xml><?xml version="1.0" encoding="utf-8"?>
 <ds:datastoreItem xmlns:ds="http://schemas.openxmlformats.org/officeDocument/2006/customXml" ds:itemID="{D6602E3C-70F5-412B-A646-0548AF3EB1F8}">
   <ds:schemaRefs>
     <ds:schemaRef ds:uri="http://schemas.microsoft.com/office/2006/metadata/properties"/>
@@ -20780,4 +20783,12 @@
     <ds:schemaRef ds:uri="461e5654-0e9a-4527-837d-fdc364c1f1ed"/>
   </ds:schemaRefs>
 </ds:datastoreItem>
+</file>
+
+<file path=customXml/itemProps4.xml><?xml version="1.0" encoding="utf-8"?>
+<ds:datastoreItem xmlns:ds="http://schemas.openxmlformats.org/officeDocument/2006/customXml" ds:itemID="{1AA002EC-9FAC-469B-886C-4AD0DF10DF17}">
+  <ds:schemaRefs>
+    <ds:schemaRef ds:uri="http://schemas.openxmlformats.org/officeDocument/2006/bibliography"/>
+  </ds:schemaRefs>
+</ds:datastoreItem>
 </file>
</xml_diff>

<commit_message>
MRD-3244 update Part A template + preview (#1359)
</commit_message>
<xml_diff>
--- a/src/main/resources/templates/partA/2026-07-29 - FTR56 Offence conviction/Part A Template.docx
+++ b/src/main/resources/templates/partA/2026-07-29 - FTR56 Offence conviction/Part A Template.docx
@@ -416,7 +416,7 @@
       <w:r>
         <w:rPr>
           <w:rFonts w:ascii="Arial" w:hAnsi="Arial" w:cs="Arial"/>
-          <w:bCs/>
+          <w:b/>
         </w:rPr>
         <w:t>{{</w:t>
       </w:r>
@@ -424,7 +424,7 @@
       <w:r>
         <w:rPr>
           <w:rFonts w:ascii="Arial" w:hAnsi="Arial" w:cs="Arial"/>
-          <w:bCs/>
+          <w:b/>
         </w:rPr>
         <w:t>is_this_an_emergency_recall</w:t>
       </w:r>
@@ -432,7 +432,7 @@
       <w:r>
         <w:rPr>
           <w:rFonts w:ascii="Arial" w:hAnsi="Arial" w:cs="Arial"/>
-          <w:bCs/>
+          <w:b/>
         </w:rPr>
         <w:t>}}</w:t>
       </w:r>
@@ -506,7 +506,7 @@
       <w:r>
         <w:rPr>
           <w:rFonts w:ascii="Arial" w:hAnsi="Arial" w:cs="Arial"/>
-          <w:bCs/>
+          <w:b/>
         </w:rPr>
         <w:t>{{</w:t>
       </w:r>
@@ -514,7 +514,7 @@
       <w:r>
         <w:rPr>
           <w:rFonts w:ascii="Arial" w:hAnsi="Arial" w:cs="Arial"/>
-          <w:bCs/>
+          <w:b/>
         </w:rPr>
         <w:t>indeterminate_sentence_type</w:t>
       </w:r>
@@ -522,16 +522,16 @@
       <w:r>
         <w:rPr>
           <w:rFonts w:ascii="Arial" w:hAnsi="Arial" w:cs="Arial"/>
-          <w:bCs/>
-        </w:rPr>
-        <w:t>}} (</w:t>
-      </w:r>
-      <w:r>
-        <w:rPr>
-          <w:rFonts w:ascii="Arial" w:hAnsi="Arial" w:cs="Arial"/>
-          <w:bCs/>
-        </w:rPr>
-        <w:t>If yes move to Section 6)</w:t>
+          <w:b/>
+        </w:rPr>
+        <w:t xml:space="preserve">}} </w:t>
+      </w:r>
+      <w:r>
+        <w:rPr>
+          <w:rFonts w:ascii="Arial" w:hAnsi="Arial" w:cs="Arial"/>
+          <w:bCs/>
+        </w:rPr>
+        <w:t>(If yes move to Section 6)</w:t>
       </w:r>
       <w:r>
         <w:rPr>
@@ -583,7 +583,7 @@
       <w:r>
         <w:rPr>
           <w:rFonts w:ascii="Arial" w:hAnsi="Arial" w:cs="Arial"/>
-          <w:bCs/>
+          <w:b/>
         </w:rPr>
         <w:t>{{</w:t>
       </w:r>
@@ -591,7 +591,7 @@
       <w:r>
         <w:rPr>
           <w:rFonts w:ascii="Arial" w:hAnsi="Arial" w:cs="Arial"/>
-          <w:bCs/>
+          <w:b/>
         </w:rPr>
         <w:t>is_extended_sentence</w:t>
       </w:r>
@@ -599,16 +599,16 @@
       <w:r>
         <w:rPr>
           <w:rFonts w:ascii="Arial" w:hAnsi="Arial" w:cs="Arial"/>
-          <w:bCs/>
-        </w:rPr>
-        <w:t>}}</w:t>
-      </w:r>
-      <w:r>
-        <w:rPr>
-          <w:rFonts w:ascii="Arial" w:hAnsi="Arial" w:cs="Arial"/>
-          <w:bCs/>
-        </w:rPr>
-        <w:t xml:space="preserve"> (If yes move to Section 6)</w:t>
+          <w:b/>
+        </w:rPr>
+        <w:t xml:space="preserve">}} </w:t>
+      </w:r>
+      <w:r>
+        <w:rPr>
+          <w:rFonts w:ascii="Arial" w:hAnsi="Arial" w:cs="Arial"/>
+          <w:bCs/>
+        </w:rPr>
+        <w:t>(If yes move to Section 6)</w:t>
       </w:r>
     </w:p>
     <w:p>
@@ -748,13 +748,20 @@
           <w:rFonts w:ascii="Arial" w:hAnsi="Arial" w:cs="Arial"/>
           <w:bCs/>
         </w:rPr>
-        <w:t xml:space="preserve"> {{</w:t>
+        <w:t xml:space="preserve"> </w:t>
+      </w:r>
+      <w:r>
+        <w:rPr>
+          <w:rFonts w:ascii="Arial" w:hAnsi="Arial" w:cs="Arial"/>
+          <w:b/>
+        </w:rPr>
+        <w:t>{{</w:t>
       </w:r>
       <w:proofErr w:type="spellStart"/>
       <w:r>
         <w:rPr>
           <w:rFonts w:ascii="Arial" w:hAnsi="Arial" w:cs="Arial"/>
-          <w:bCs/>
+          <w:b/>
         </w:rPr>
         <w:t>is_serving_youth_sentence</w:t>
       </w:r>
@@ -762,7 +769,7 @@
       <w:r>
         <w:rPr>
           <w:rFonts w:ascii="Arial" w:hAnsi="Arial" w:cs="Arial"/>
-          <w:bCs/>
+          <w:b/>
         </w:rPr>
         <w:t>}}</w:t>
       </w:r>
@@ -800,7 +807,7 @@
       <w:r>
         <w:rPr>
           <w:rFonts w:ascii="Arial" w:hAnsi="Arial" w:cs="Arial"/>
-          <w:bCs/>
+          <w:b/>
         </w:rPr>
         <w:t>{{</w:t>
       </w:r>
@@ -808,7 +815,7 @@
       <w:r>
         <w:rPr>
           <w:rFonts w:ascii="Arial" w:hAnsi="Arial" w:cs="Arial"/>
-          <w:bCs/>
+          <w:b/>
         </w:rPr>
         <w:t>is_serving_youth_sentence</w:t>
       </w:r>
@@ -816,7 +823,7 @@
       <w:r>
         <w:rPr>
           <w:rFonts w:ascii="Arial" w:hAnsi="Arial" w:cs="Arial"/>
-          <w:bCs/>
+          <w:b/>
         </w:rPr>
         <w:t>}}</w:t>
       </w:r>
@@ -951,23 +958,9 @@
       <w:r>
         <w:rPr>
           <w:rFonts w:ascii="Arial" w:hAnsi="Arial" w:cs="Arial"/>
-          <w:bCs/>
-        </w:rPr>
-        <w:t>{{is_mappa_level_2_or_3</w:t>
-      </w:r>
-      <w:r>
-        <w:rPr>
-          <w:rFonts w:ascii="Arial" w:hAnsi="Arial" w:cs="Arial"/>
-          <w:bCs/>
-        </w:rPr>
-        <w:t>_as_youth_sds_under_12_months</w:t>
-      </w:r>
-      <w:r>
-        <w:rPr>
-          <w:rFonts w:ascii="Arial" w:hAnsi="Arial" w:cs="Arial"/>
-          <w:bCs/>
-        </w:rPr>
-        <w:t>}}</w:t>
+          <w:b/>
+        </w:rPr>
+        <w:t>{{is_mappa_level_2_or_3_as_youth_sds_under_12_months}}</w:t>
       </w:r>
     </w:p>
     <w:p>
@@ -1003,7 +996,7 @@
       <w:r>
         <w:rPr>
           <w:rFonts w:ascii="Arial" w:hAnsi="Arial" w:cs="Arial"/>
-          <w:bCs/>
+          <w:b/>
         </w:rPr>
         <w:t>{{</w:t>
       </w:r>
@@ -1011,7 +1004,7 @@
       <w:r>
         <w:rPr>
           <w:rFonts w:ascii="Arial" w:hAnsi="Arial" w:cs="Arial"/>
-          <w:bCs/>
+          <w:b/>
         </w:rPr>
         <w:t>is_youth_charged_with_serious_offence</w:t>
       </w:r>
@@ -1019,7 +1012,7 @@
       <w:r>
         <w:rPr>
           <w:rFonts w:ascii="Arial" w:hAnsi="Arial" w:cs="Arial"/>
-          <w:bCs/>
+          <w:b/>
         </w:rPr>
         <w:t>}}</w:t>
       </w:r>
@@ -1162,7 +1155,7 @@
       <w:r>
         <w:rPr>
           <w:rFonts w:ascii="Arial" w:hAnsi="Arial" w:cs="Arial"/>
-          <w:bCs/>
+          <w:b/>
         </w:rPr>
         <w:t>{{</w:t>
       </w:r>
@@ -1170,7 +1163,7 @@
       <w:r>
         <w:rPr>
           <w:rFonts w:ascii="Arial" w:hAnsi="Arial" w:cs="Arial"/>
-          <w:bCs/>
+          <w:b/>
         </w:rPr>
         <w:t>is_charged_and_convicted_with_offence</w:t>
       </w:r>
@@ -1178,7 +1171,7 @@
       <w:r>
         <w:rPr>
           <w:rFonts w:ascii="Arial" w:hAnsi="Arial" w:cs="Arial"/>
-          <w:bCs/>
+          <w:b/>
         </w:rPr>
         <w:t>}}</w:t>
       </w:r>
@@ -1257,36 +1250,37 @@
         <w:outlineLvl w:val="1"/>
         <w:rPr>
           <w:rFonts w:ascii="Arial" w:hAnsi="Arial" w:cs="Arial"/>
-        </w:rPr>
-      </w:pPr>
-      <w:r>
-        <w:rPr>
-          <w:rFonts w:ascii="Arial" w:hAnsi="Arial" w:cs="Arial"/>
-        </w:rPr>
-        <w:t xml:space="preserve">Is their MAPPA level 2 or 3? </w:t>
-      </w:r>
-      <w:r>
-        <w:rPr>
-          <w:rFonts w:ascii="Arial" w:hAnsi="Arial" w:cs="Arial"/>
-          <w:bCs/>
-        </w:rPr>
-        <w:t>{{is_mappa_level_2_or_3</w:t>
-      </w:r>
-      <w:r>
-        <w:rPr>
-          <w:rFonts w:ascii="Arial" w:hAnsi="Arial" w:cs="Arial"/>
-          <w:bCs/>
-        </w:rPr>
-        <w:t>_as_adult_sds</w:t>
-      </w:r>
-      <w:r>
-        <w:rPr>
-          <w:rFonts w:ascii="Arial" w:hAnsi="Arial" w:cs="Arial"/>
-          <w:bCs/>
-        </w:rPr>
-        <w:t>}}</w:t>
-      </w:r>
-      <w:r>
+          <w:b/>
+          <w:bCs/>
+        </w:rPr>
+      </w:pPr>
+      <w:r>
+        <w:rPr>
+          <w:rFonts w:ascii="Arial" w:hAnsi="Arial" w:cs="Arial"/>
+        </w:rPr>
+        <w:t>Is their MAPPA level 2 or 3?</w:t>
+      </w:r>
+      <w:r>
+        <w:rPr>
+          <w:rFonts w:ascii="Arial" w:hAnsi="Arial" w:cs="Arial"/>
+          <w:b/>
+          <w:bCs/>
+        </w:rPr>
+        <w:t xml:space="preserve"> </w:t>
+      </w:r>
+      <w:r>
+        <w:rPr>
+          <w:rFonts w:ascii="Arial" w:hAnsi="Arial" w:cs="Arial"/>
+          <w:b/>
+          <w:bCs/>
+        </w:rPr>
+        <w:t>{{is_mappa_level_2_or_3_as_adult_sds}}</w:t>
+      </w:r>
+      <w:r>
+        <w:rPr>
+          <w:b/>
+          <w:bCs/>
+        </w:rPr>
         <w:br/>
       </w:r>
       <w:r>
@@ -1299,12 +1293,14 @@
         <w:rPr>
           <w:rFonts w:ascii="Arial" w:hAnsi="Arial" w:cs="Arial"/>
           <w:b/>
+          <w:bCs/>
         </w:rPr>
         <w:t xml:space="preserve"> </w:t>
       </w:r>
       <w:r>
         <w:rPr>
           <w:rFonts w:ascii="Arial" w:hAnsi="Arial" w:cs="Arial"/>
+          <w:b/>
           <w:bCs/>
         </w:rPr>
         <w:t>{{</w:t>
@@ -1313,42 +1309,16 @@
       <w:r>
         <w:rPr>
           <w:rFonts w:ascii="Arial" w:hAnsi="Arial" w:cs="Arial"/>
-          <w:bCs/>
-        </w:rPr>
-        <w:t>is_serving_</w:t>
-      </w:r>
-      <w:r>
-        <w:rPr>
-          <w:rFonts w:ascii="Arial" w:hAnsi="Arial" w:cs="Arial"/>
-          <w:bCs/>
-        </w:rPr>
-        <w:t>sopc</w:t>
-      </w:r>
-      <w:r>
-        <w:rPr>
-          <w:rFonts w:ascii="Arial" w:hAnsi="Arial" w:cs="Arial"/>
-          <w:bCs/>
-        </w:rPr>
-        <w:t>_</w:t>
-      </w:r>
-      <w:r>
-        <w:rPr>
-          <w:rFonts w:ascii="Arial" w:hAnsi="Arial" w:cs="Arial"/>
-          <w:bCs/>
-        </w:rPr>
-        <w:t>s</w:t>
-      </w:r>
-      <w:r>
-        <w:rPr>
-          <w:rFonts w:ascii="Arial" w:hAnsi="Arial" w:cs="Arial"/>
-          <w:bCs/>
-        </w:rPr>
-        <w:t>entence</w:t>
+          <w:b/>
+          <w:bCs/>
+        </w:rPr>
+        <w:t>is_serving_sopc_sentence</w:t>
       </w:r>
       <w:proofErr w:type="spellEnd"/>
       <w:r>
         <w:rPr>
           <w:rFonts w:ascii="Arial" w:hAnsi="Arial" w:cs="Arial"/>
+          <w:b/>
           <w:bCs/>
         </w:rPr>
         <w:t>}}</w:t>
@@ -1367,17 +1337,28 @@
         <w:outlineLvl w:val="1"/>
         <w:rPr>
           <w:rFonts w:ascii="Arial" w:hAnsi="Arial" w:cs="Arial"/>
-        </w:rPr>
-      </w:pPr>
-      <w:r>
-        <w:rPr>
-          <w:rFonts w:ascii="Arial" w:hAnsi="Arial" w:cs="Arial"/>
-        </w:rPr>
-        <w:t xml:space="preserve">Are they serving a Discretionary Conditional Release (DCR) sentence? </w:t>
-      </w:r>
-      <w:r>
-        <w:rPr>
-          <w:rFonts w:ascii="Arial" w:hAnsi="Arial" w:cs="Arial"/>
+          <w:b/>
+          <w:bCs/>
+        </w:rPr>
+      </w:pPr>
+      <w:r>
+        <w:rPr>
+          <w:rFonts w:ascii="Arial" w:hAnsi="Arial" w:cs="Arial"/>
+        </w:rPr>
+        <w:t>Are they serving a Discretionary Conditional Release (DCR) sentence?</w:t>
+      </w:r>
+      <w:r>
+        <w:rPr>
+          <w:rFonts w:ascii="Arial" w:hAnsi="Arial" w:cs="Arial"/>
+          <w:b/>
+          <w:bCs/>
+        </w:rPr>
+        <w:t xml:space="preserve"> </w:t>
+      </w:r>
+      <w:r>
+        <w:rPr>
+          <w:rFonts w:ascii="Arial" w:hAnsi="Arial" w:cs="Arial"/>
+          <w:b/>
           <w:bCs/>
         </w:rPr>
         <w:t>{{</w:t>
@@ -1386,28 +1367,16 @@
       <w:r>
         <w:rPr>
           <w:rFonts w:ascii="Arial" w:hAnsi="Arial" w:cs="Arial"/>
-          <w:bCs/>
-        </w:rPr>
-        <w:t>is_serving_</w:t>
-      </w:r>
-      <w:r>
-        <w:rPr>
-          <w:rFonts w:ascii="Arial" w:hAnsi="Arial" w:cs="Arial"/>
-          <w:bCs/>
-        </w:rPr>
-        <w:t>dcr</w:t>
-      </w:r>
-      <w:r>
-        <w:rPr>
-          <w:rFonts w:ascii="Arial" w:hAnsi="Arial" w:cs="Arial"/>
-          <w:bCs/>
-        </w:rPr>
-        <w:t>_sentence</w:t>
+          <w:b/>
+          <w:bCs/>
+        </w:rPr>
+        <w:t>is_serving_dcr_sentence</w:t>
       </w:r>
       <w:proofErr w:type="spellEnd"/>
       <w:r>
         <w:rPr>
           <w:rFonts w:ascii="Arial" w:hAnsi="Arial" w:cs="Arial"/>
+          <w:b/>
           <w:bCs/>
         </w:rPr>
         <w:t>}}</w:t>
@@ -1426,6 +1395,8 @@
         <w:outlineLvl w:val="1"/>
         <w:rPr>
           <w:rFonts w:ascii="Arial" w:hAnsi="Arial" w:cs="Arial"/>
+          <w:b/>
+          <w:bCs/>
         </w:rPr>
       </w:pPr>
       <w:r>
@@ -1433,11 +1404,20 @@
           <w:rFonts w:ascii="Arial" w:hAnsi="Arial" w:cs="Arial"/>
         </w:rPr>
         <w:lastRenderedPageBreak/>
-        <w:t xml:space="preserve">Were they referred to the Parole Board under section 244ZB (power to detain) on this sentence? </w:t>
-      </w:r>
-      <w:r>
-        <w:rPr>
-          <w:rFonts w:ascii="Arial" w:hAnsi="Arial" w:cs="Arial"/>
+        <w:t>Were they referred to the Parole Board under section 244ZB (power to detain) on this sentence?</w:t>
+      </w:r>
+      <w:r>
+        <w:rPr>
+          <w:rFonts w:ascii="Arial" w:hAnsi="Arial" w:cs="Arial"/>
+          <w:b/>
+          <w:bCs/>
+        </w:rPr>
+        <w:t xml:space="preserve"> </w:t>
+      </w:r>
+      <w:r>
+        <w:rPr>
+          <w:rFonts w:ascii="Arial" w:hAnsi="Arial" w:cs="Arial"/>
+          <w:b/>
           <w:bCs/>
         </w:rPr>
         <w:t>{{was_referred_to_parole_board_244zb}}</w:t>
@@ -1456,17 +1436,28 @@
         <w:outlineLvl w:val="1"/>
         <w:rPr>
           <w:rFonts w:ascii="Arial" w:hAnsi="Arial" w:cs="Arial"/>
-        </w:rPr>
-      </w:pPr>
-      <w:r>
-        <w:rPr>
-          <w:rFonts w:ascii="Arial" w:hAnsi="Arial" w:cs="Arial"/>
-        </w:rPr>
-        <w:t xml:space="preserve">Have they been repatriated to the UK following a sentence for murder? </w:t>
-      </w:r>
-      <w:r>
-        <w:rPr>
-          <w:rFonts w:ascii="Arial" w:hAnsi="Arial" w:cs="Arial"/>
+          <w:b/>
+          <w:bCs/>
+        </w:rPr>
+      </w:pPr>
+      <w:r>
+        <w:rPr>
+          <w:rFonts w:ascii="Arial" w:hAnsi="Arial" w:cs="Arial"/>
+        </w:rPr>
+        <w:t>Have they been repatriated to the UK following a sentence for murder?</w:t>
+      </w:r>
+      <w:r>
+        <w:rPr>
+          <w:rFonts w:ascii="Arial" w:hAnsi="Arial" w:cs="Arial"/>
+          <w:b/>
+          <w:bCs/>
+        </w:rPr>
+        <w:t xml:space="preserve"> </w:t>
+      </w:r>
+      <w:r>
+        <w:rPr>
+          <w:rFonts w:ascii="Arial" w:hAnsi="Arial" w:cs="Arial"/>
+          <w:b/>
           <w:bCs/>
         </w:rPr>
         <w:t>{{</w:t>
@@ -1475,6 +1466,7 @@
       <w:r>
         <w:rPr>
           <w:rFonts w:ascii="Arial" w:hAnsi="Arial" w:cs="Arial"/>
+          <w:b/>
           <w:bCs/>
         </w:rPr>
         <w:t>was_repatriated_for_murder</w:t>
@@ -1483,6 +1475,7 @@
       <w:r>
         <w:rPr>
           <w:rFonts w:ascii="Arial" w:hAnsi="Arial" w:cs="Arial"/>
+          <w:b/>
           <w:bCs/>
         </w:rPr>
         <w:t>}}</w:t>
@@ -1501,34 +1494,31 @@
         <w:outlineLvl w:val="1"/>
         <w:rPr>
           <w:rFonts w:ascii="Arial" w:hAnsi="Arial" w:cs="Arial"/>
-        </w:rPr>
-      </w:pPr>
-      <w:r>
-        <w:rPr>
-          <w:rFonts w:ascii="Arial" w:hAnsi="Arial" w:cs="Arial"/>
-        </w:rPr>
-        <w:t xml:space="preserve">Are they MAPPA category 4? </w:t>
-      </w:r>
-      <w:r>
-        <w:rPr>
-          <w:rFonts w:ascii="Arial" w:hAnsi="Arial" w:cs="Arial"/>
-          <w:bCs/>
-        </w:rPr>
-        <w:t>{{is_mappa_category_4</w:t>
-      </w:r>
-      <w:r>
-        <w:rPr>
-          <w:rFonts w:ascii="Arial" w:hAnsi="Arial" w:cs="Arial"/>
-          <w:bCs/>
-        </w:rPr>
-        <w:t>_as_adult_sds</w:t>
-      </w:r>
-      <w:r>
-        <w:rPr>
-          <w:rFonts w:ascii="Arial" w:hAnsi="Arial" w:cs="Arial"/>
-          <w:bCs/>
-        </w:rPr>
-        <w:t>}}</w:t>
+          <w:b/>
+          <w:bCs/>
+        </w:rPr>
+      </w:pPr>
+      <w:r>
+        <w:rPr>
+          <w:rFonts w:ascii="Arial" w:hAnsi="Arial" w:cs="Arial"/>
+        </w:rPr>
+        <w:t>Are they MAPPA category 4?</w:t>
+      </w:r>
+      <w:r>
+        <w:rPr>
+          <w:rFonts w:ascii="Arial" w:hAnsi="Arial" w:cs="Arial"/>
+          <w:b/>
+          <w:bCs/>
+        </w:rPr>
+        <w:t xml:space="preserve"> </w:t>
+      </w:r>
+      <w:r>
+        <w:rPr>
+          <w:rFonts w:ascii="Arial" w:hAnsi="Arial" w:cs="Arial"/>
+          <w:b/>
+          <w:bCs/>
+        </w:rPr>
+        <w:t>{{is_mappa_category_4_as_adult_sds}}</w:t>
       </w:r>
     </w:p>
     <w:p>
@@ -1544,17 +1534,28 @@
         <w:outlineLvl w:val="1"/>
         <w:rPr>
           <w:rFonts w:ascii="Arial" w:hAnsi="Arial" w:cs="Arial"/>
-        </w:rPr>
-      </w:pPr>
-      <w:r>
-        <w:rPr>
-          <w:rFonts w:ascii="Arial" w:hAnsi="Arial" w:cs="Arial"/>
-        </w:rPr>
-        <w:t xml:space="preserve">Are they considered to be a person who may be at risk of involvement in foreign power threat activity? </w:t>
-      </w:r>
-      <w:r>
-        <w:rPr>
-          <w:rFonts w:ascii="Arial" w:hAnsi="Arial" w:cs="Arial"/>
+          <w:b/>
+          <w:bCs/>
+        </w:rPr>
+      </w:pPr>
+      <w:r>
+        <w:rPr>
+          <w:rFonts w:ascii="Arial" w:hAnsi="Arial" w:cs="Arial"/>
+        </w:rPr>
+        <w:t>Are they considered to be a person who may be at risk of involvement in foreign power threat activity?</w:t>
+      </w:r>
+      <w:r>
+        <w:rPr>
+          <w:rFonts w:ascii="Arial" w:hAnsi="Arial" w:cs="Arial"/>
+          <w:b/>
+          <w:bCs/>
+        </w:rPr>
+        <w:t xml:space="preserve"> </w:t>
+      </w:r>
+      <w:r>
+        <w:rPr>
+          <w:rFonts w:ascii="Arial" w:hAnsi="Arial" w:cs="Arial"/>
+          <w:b/>
           <w:bCs/>
         </w:rPr>
         <w:t>{{</w:t>
@@ -1563,6 +1564,7 @@
       <w:r>
         <w:rPr>
           <w:rFonts w:ascii="Arial" w:hAnsi="Arial" w:cs="Arial"/>
+          <w:b/>
           <w:bCs/>
         </w:rPr>
         <w:t>is_at_risk_of_involved_in_foreign_power_threat</w:t>
@@ -1571,6 +1573,7 @@
       <w:r>
         <w:rPr>
           <w:rFonts w:ascii="Arial" w:hAnsi="Arial" w:cs="Arial"/>
+          <w:b/>
           <w:bCs/>
         </w:rPr>
         <w:t>}}</w:t>
@@ -1589,17 +1592,28 @@
         <w:outlineLvl w:val="1"/>
         <w:rPr>
           <w:rFonts w:ascii="Arial" w:hAnsi="Arial" w:cs="Arial"/>
-        </w:rPr>
-      </w:pPr>
-      <w:r>
-        <w:rPr>
-          <w:rFonts w:ascii="Arial" w:hAnsi="Arial" w:cs="Arial"/>
-        </w:rPr>
-        <w:t xml:space="preserve">Are they serving a sentence for a terrorist or national security offence? </w:t>
-      </w:r>
-      <w:r>
-        <w:rPr>
-          <w:rFonts w:ascii="Arial" w:hAnsi="Arial" w:cs="Arial"/>
+          <w:b/>
+          <w:bCs/>
+        </w:rPr>
+      </w:pPr>
+      <w:r>
+        <w:rPr>
+          <w:rFonts w:ascii="Arial" w:hAnsi="Arial" w:cs="Arial"/>
+        </w:rPr>
+        <w:t>Are they serving a sentence for a terrorist or national security offence?</w:t>
+      </w:r>
+      <w:r>
+        <w:rPr>
+          <w:rFonts w:ascii="Arial" w:hAnsi="Arial" w:cs="Arial"/>
+          <w:b/>
+          <w:bCs/>
+        </w:rPr>
+        <w:t xml:space="preserve"> </w:t>
+      </w:r>
+      <w:r>
+        <w:rPr>
+          <w:rFonts w:ascii="Arial" w:hAnsi="Arial" w:cs="Arial"/>
+          <w:b/>
           <w:bCs/>
         </w:rPr>
         <w:t>{{</w:t>
@@ -1608,21 +1622,16 @@
       <w:r>
         <w:rPr>
           <w:rFonts w:ascii="Arial" w:hAnsi="Arial" w:cs="Arial"/>
-          <w:bCs/>
-        </w:rPr>
-        <w:t>is_serving_terrorist_or_national_</w:t>
-      </w:r>
-      <w:r>
-        <w:rPr>
-          <w:rFonts w:ascii="Arial" w:hAnsi="Arial" w:cs="Arial"/>
-          <w:bCs/>
-        </w:rPr>
-        <w:t>security_offence</w:t>
+          <w:b/>
+          <w:bCs/>
+        </w:rPr>
+        <w:t>is_serving_terrorist_or_national_security_offence</w:t>
       </w:r>
       <w:proofErr w:type="spellEnd"/>
       <w:r>
         <w:rPr>
           <w:rFonts w:ascii="Arial" w:hAnsi="Arial" w:cs="Arial"/>
+          <w:b/>
           <w:bCs/>
         </w:rPr>
         <w:t>}}</w:t>
@@ -19638,6 +19647,7 @@
     <w:rsid w:val="002E2013"/>
     <w:rsid w:val="00314A9B"/>
     <w:rsid w:val="0031554E"/>
+    <w:rsid w:val="00323EAB"/>
     <w:rsid w:val="003371B1"/>
     <w:rsid w:val="00340D3A"/>
     <w:rsid w:val="00362F55"/>
@@ -19698,6 +19708,7 @@
     <w:rsid w:val="00B5434A"/>
     <w:rsid w:val="00B60D5F"/>
     <w:rsid w:val="00BA6EAB"/>
+    <w:rsid w:val="00BA736E"/>
     <w:rsid w:val="00BA77B8"/>
     <w:rsid w:val="00BE6AD5"/>
     <w:rsid w:val="00C22920"/>
@@ -20499,15 +20510,6 @@
 </file>
 
 <file path=customXml/item1.xml><?xml version="1.0" encoding="utf-8"?>
-<?mso-contentType ?>
-<FormTemplates xmlns="http://schemas.microsoft.com/sharepoint/v3/contenttype/forms">
-  <Display>DocumentLibraryForm</Display>
-  <Edit>DocumentLibraryForm</Edit>
-  <New>DocumentLibraryForm</New>
-</FormTemplates>
-</file>
-
-<file path=customXml/item2.xml><?xml version="1.0" encoding="utf-8"?>
 <ct:contentTypeSchema xmlns:ct="http://schemas.microsoft.com/office/2006/metadata/contentType" xmlns:ma="http://schemas.microsoft.com/office/2006/metadata/properties/metaAttributes" ct:_="" ma:_="" ma:contentTypeName="Document" ma:contentTypeID="0x010100BB15E224CEB19F4BA17DCD08B156C20E" ma:contentTypeVersion="14" ma:contentTypeDescription="Create a new document." ma:contentTypeScope="" ma:versionID="7cd304efa23d0061db26e2f05b6414b1">
   <xsd:schema xmlns:xsd="http://www.w3.org/2001/XMLSchema" xmlns:xs="http://www.w3.org/2001/XMLSchema" xmlns:p="http://schemas.microsoft.com/office/2006/metadata/properties" xmlns:ns2="2244256a-353e-4aaa-84de-68fbd58bc0b5" xmlns:ns3="461e5654-0e9a-4527-837d-fdc364c1f1ed" targetNamespace="http://schemas.microsoft.com/office/2006/metadata/properties" ma:root="true" ma:fieldsID="44df93feef4834377720eaaf16faf4fa" ns2:_="" ns3:_="">
     <xsd:import namespace="2244256a-353e-4aaa-84de-68fbd58bc0b5"/>
@@ -20720,11 +20722,16 @@
 </ct:contentTypeSchema>
 </file>
 
-<file path=customXml/item3.xml><?xml version="1.0" encoding="utf-8"?>
-<b:Sources xmlns:b="http://schemas.openxmlformats.org/officeDocument/2006/bibliography" xmlns="http://schemas.openxmlformats.org/officeDocument/2006/bibliography" SelectedStyle="" StyleName="" Version="0"/>
+<file path=customXml/item2.xml><?xml version="1.0" encoding="utf-8"?>
+<?mso-contentType ?>
+<FormTemplates xmlns="http://schemas.microsoft.com/sharepoint/v3/contenttype/forms">
+  <Display>DocumentLibraryForm</Display>
+  <Edit>DocumentLibraryForm</Edit>
+  <New>DocumentLibraryForm</New>
+</FormTemplates>
 </file>
 
-<file path=customXml/item4.xml><?xml version="1.0" encoding="utf-8"?>
+<file path=customXml/item3.xml><?xml version="1.0" encoding="utf-8"?>
 <p:properties xmlns:p="http://schemas.microsoft.com/office/2006/metadata/properties" xmlns:xsi="http://www.w3.org/2001/XMLSchema-instance" xmlns:pc="http://schemas.microsoft.com/office/infopath/2007/PartnerControls">
   <documentManagement>
     <lcf76f155ced4ddcb4097134ff3c332f xmlns="2244256a-353e-4aaa-84de-68fbd58bc0b5">
@@ -20736,15 +20743,11 @@
 </p:properties>
 </file>
 
-<file path=customXml/itemProps1.xml><?xml version="1.0" encoding="utf-8"?>
-<ds:datastoreItem xmlns:ds="http://schemas.openxmlformats.org/officeDocument/2006/customXml" ds:itemID="{9C893AAC-1781-44C1-940F-A467E506D9D1}">
-  <ds:schemaRefs>
-    <ds:schemaRef ds:uri="http://schemas.microsoft.com/sharepoint/v3/contenttype/forms"/>
-  </ds:schemaRefs>
-</ds:datastoreItem>
+<file path=customXml/item4.xml><?xml version="1.0" encoding="utf-8"?>
+<b:Sources xmlns:b="http://schemas.openxmlformats.org/officeDocument/2006/bibliography" xmlns="http://schemas.openxmlformats.org/officeDocument/2006/bibliography" SelectedStyle="" StyleName="" Version="0"/>
 </file>
 
-<file path=customXml/itemProps2.xml><?xml version="1.0" encoding="utf-8"?>
+<file path=customXml/itemProps1.xml><?xml version="1.0" encoding="utf-8"?>
 <ds:datastoreItem xmlns:ds="http://schemas.openxmlformats.org/officeDocument/2006/customXml" ds:itemID="{79C448BA-7A2C-492D-9615-F080CE57201F}">
   <ds:schemaRefs>
     <ds:schemaRef ds:uri="http://schemas.microsoft.com/office/2006/metadata/contentType"/>
@@ -20763,15 +20766,15 @@
 </ds:datastoreItem>
 </file>
 
-<file path=customXml/itemProps3.xml><?xml version="1.0" encoding="utf-8"?>
-<ds:datastoreItem xmlns:ds="http://schemas.openxmlformats.org/officeDocument/2006/customXml" ds:itemID="{1AA002EC-9FAC-469B-886C-4AD0DF10DF17}">
+<file path=customXml/itemProps2.xml><?xml version="1.0" encoding="utf-8"?>
+<ds:datastoreItem xmlns:ds="http://schemas.openxmlformats.org/officeDocument/2006/customXml" ds:itemID="{9C893AAC-1781-44C1-940F-A467E506D9D1}">
   <ds:schemaRefs>
-    <ds:schemaRef ds:uri="http://schemas.openxmlformats.org/officeDocument/2006/bibliography"/>
+    <ds:schemaRef ds:uri="http://schemas.microsoft.com/sharepoint/v3/contenttype/forms"/>
   </ds:schemaRefs>
 </ds:datastoreItem>
 </file>
 
-<file path=customXml/itemProps4.xml><?xml version="1.0" encoding="utf-8"?>
+<file path=customXml/itemProps3.xml><?xml version="1.0" encoding="utf-8"?>
 <ds:datastoreItem xmlns:ds="http://schemas.openxmlformats.org/officeDocument/2006/customXml" ds:itemID="{D6602E3C-70F5-412B-A646-0548AF3EB1F8}">
   <ds:schemaRefs>
     <ds:schemaRef ds:uri="http://schemas.microsoft.com/office/2006/metadata/properties"/>
@@ -20780,4 +20783,12 @@
     <ds:schemaRef ds:uri="461e5654-0e9a-4527-837d-fdc364c1f1ed"/>
   </ds:schemaRefs>
 </ds:datastoreItem>
+</file>
+
+<file path=customXml/itemProps4.xml><?xml version="1.0" encoding="utf-8"?>
+<ds:datastoreItem xmlns:ds="http://schemas.openxmlformats.org/officeDocument/2006/customXml" ds:itemID="{1AA002EC-9FAC-469B-886C-4AD0DF10DF17}">
+  <ds:schemaRefs>
+    <ds:schemaRef ds:uri="http://schemas.openxmlformats.org/officeDocument/2006/bibliography"/>
+  </ds:schemaRefs>
+</ds:datastoreItem>
 </file>
</xml_diff>